<commit_message>
Shartnoma UZ shablonini DIDOX matni bilan sinxronlashtirish
DIDOX shartnomasidagi toliq matn (fors-major va yakuniy qoidalar
bolimlari, yetishmayotgan 5.4-5.9 bandlar) shartnoma-uz.docx
shabloniga kochirildi. Narx {narx}/{narx_sozda} teglari orqali
loyihaning haqiqiy toliq summasini korsatishda davom etadi (DIDOX
dagi qatiy 250000 emas). Eskirgan direktor ismi Turabekov N.B.
Sarimsakov J.Sh.ga tuzatildi (joriy Ariza sahifasi imzosiga mos).

Co-Authored-By: Claude Sonnet 5 <noreply@anthropic.com>
</commit_message>
<xml_diff>
--- a/resources/templates/shartnoma-uz.docx
+++ b/resources/templates/shartnoma-uz.docx
@@ -20,7 +20,7 @@
           <w:sz w:val="32"/>
           <w:szCs w:val="32"/>
         </w:rPr>
-        <w:t xml:space="preserve">SHARTNOMA</w:t>
+        <w:t xml:space="preserve">Shartnoma №{raqam}</w:t>
       </w:r>
     </w:p>
     <w:p>
@@ -39,45 +39,45 @@
           <w:sz w:val="20"/>
           <w:szCs w:val="20"/>
         </w:rPr>
-        <w:t xml:space="preserve">Ilmiy-texnik mahsulot tushunchasiga kiruvchi loyihalash, izlanish va boshqa dizayn xizmatlarini bajarish uchun</w:t>
+        <w:t xml:space="preserve">Loyihaviy, qidiruv va ilmiy-texnik mahsulot tushunchasiga kiruvchi boshqa dizaynerlik xizmatlarini bajarish to'g'risida</w:t>
       </w:r>
     </w:p>
     <w:p>
       <w:pPr>
         <w:spacing w:after="140" w:line="240" w:lineRule="auto"/>
-        <w:jc w:val="both"/>
-        <w:rPr>
-          <w:rFonts w:ascii="Times New Roman" w:hAnsi="Times New Roman" w:cs="Times New Roman"/>
-          <w:sz w:val="20"/>
-          <w:szCs w:val="20"/>
-        </w:rPr>
-      </w:pPr>
-      <w:r>
-        <w:rPr>
-          <w:rFonts w:ascii="Times New Roman" w:hAnsi="Times New Roman" w:cs="Times New Roman"/>
-          <w:sz w:val="20"/>
-          <w:szCs w:val="20"/>
-        </w:rPr>
-        <w:t xml:space="preserve">Toshkent sh.                                                                                   {sana}</w:t>
-      </w:r>
-    </w:p>
-    <w:p>
-      <w:pPr>
-        <w:spacing w:after="60" w:line="240" w:lineRule="auto"/>
-        <w:jc w:val="both"/>
-        <w:rPr>
-          <w:rFonts w:ascii="Times New Roman" w:hAnsi="Times New Roman" w:cs="Times New Roman"/>
-          <w:sz w:val="20"/>
-          <w:szCs w:val="20"/>
-        </w:rPr>
-      </w:pPr>
-      <w:r>
-        <w:rPr>
-          <w:rFonts w:ascii="Times New Roman" w:hAnsi="Times New Roman" w:cs="Times New Roman"/>
-          <w:sz w:val="20"/>
-          <w:szCs w:val="20"/>
-        </w:rPr>
-        <w:t xml:space="preserve">«MY PERFEKT HOME» MChJ, keyingi o'rinlarda «IJROCHI» deb yuritiluvchi, direktor Turabekov N.B. shaxsida, Ustav va 26-07-2021 yildagi № AL-001868 litsenziya asosida ish yurituvchi, bir tomondan, hamda {ism}, keyingi o'rinlarda «BUYURTMACHI» deb yuritiluvchi, jismoniy shaxs sifatida pasport asosida ish yurituvchi, ikkinchi tomondan, quyidagilar to'g'risida ushbu shartnomani tuzdilar:</w:t>
+        <w:jc w:val="right"/>
+        <w:rPr>
+          <w:rFonts w:ascii="Times New Roman" w:hAnsi="Times New Roman" w:cs="Times New Roman"/>
+          <w:sz w:val="20"/>
+          <w:szCs w:val="20"/>
+        </w:rPr>
+      </w:pPr>
+      <w:r>
+        <w:rPr>
+          <w:rFonts w:ascii="Times New Roman" w:hAnsi="Times New Roman" w:cs="Times New Roman"/>
+          <w:sz w:val="20"/>
+          <w:szCs w:val="20"/>
+        </w:rPr>
+        <w:t xml:space="preserve">Toshkent sh.                                                                                   {sana} yil</w:t>
+      </w:r>
+    </w:p>
+    <w:p>
+      <w:pPr>
+        <w:spacing w:after="140" w:line="240" w:lineRule="auto"/>
+        <w:jc w:val="both"/>
+        <w:rPr>
+          <w:rFonts w:ascii="Times New Roman" w:hAnsi="Times New Roman" w:cs="Times New Roman"/>
+          <w:sz w:val="20"/>
+          <w:szCs w:val="20"/>
+        </w:rPr>
+      </w:pPr>
+      <w:r>
+        <w:rPr>
+          <w:rFonts w:ascii="Times New Roman" w:hAnsi="Times New Roman" w:cs="Times New Roman"/>
+          <w:sz w:val="20"/>
+          <w:szCs w:val="20"/>
+        </w:rPr>
+        <w:t xml:space="preserve">MChJ «MY PERFEKT HOME» (keyingi o'rinlarda «IJROCHI» deb yuritiladi), Ustav va 26-iyul 2021-yildagi AL-001868-sonli Litsenziya asosida harakat qiluvchi direktor J.Sh.Sarimsakov shaxsida bir tomondan va {ism} (keyingi o'rinlarda «BUYURTMACHI» deb yuritiladi), pasport asosida harakat qiluvchi jismoniy shaxs, ikkinchi tomondan, quyidagilar to'g'risida ushbu shartnomani tuzdilar:</w:t>
       </w:r>
     </w:p>
     <w:p>
@@ -117,45 +117,45 @@
           <w:sz w:val="20"/>
           <w:szCs w:val="20"/>
         </w:rPr>
-        <w:t xml:space="preserve">«BUYURTMACHI» topshiradi, «IJROCHI» esa quyidagi xizmatlarni bajarish majburiyatini oladi: hujjatlarni loyihalash va yuritish. Manzil: {manzil}.</w:t>
-      </w:r>
-    </w:p>
-    <w:p>
-      <w:pPr>
-        <w:spacing w:after="60" w:line="240" w:lineRule="auto"/>
-        <w:jc w:val="both"/>
-        <w:rPr>
-          <w:rFonts w:ascii="Times New Roman" w:hAnsi="Times New Roman" w:cs="Times New Roman"/>
-          <w:sz w:val="20"/>
-          <w:szCs w:val="20"/>
-        </w:rPr>
-      </w:pPr>
-      <w:r>
-        <w:rPr>
-          <w:rFonts w:ascii="Times New Roman" w:hAnsi="Times New Roman" w:cs="Times New Roman"/>
-          <w:sz w:val="20"/>
-          <w:szCs w:val="20"/>
-        </w:rPr>
-        <w:t xml:space="preserve">Ishning mazmuni, qiymati va bajarilish muddatlari loyihalash topshirig'i hamda shartnoma narxi to'g'risidagi bayonnoma bilan belgilanadi va ular Shartnomaning ajralmas qismi hisoblanadi.</w:t>
-      </w:r>
-    </w:p>
-    <w:p>
-      <w:pPr>
-        <w:spacing w:after="60" w:line="240" w:lineRule="auto"/>
-        <w:jc w:val="both"/>
-        <w:rPr>
-          <w:rFonts w:ascii="Times New Roman" w:hAnsi="Times New Roman" w:cs="Times New Roman"/>
-          <w:sz w:val="20"/>
-          <w:szCs w:val="20"/>
-        </w:rPr>
-      </w:pPr>
-      <w:r>
-        <w:rPr>
-          <w:rFonts w:ascii="Times New Roman" w:hAnsi="Times New Roman" w:cs="Times New Roman"/>
-          <w:sz w:val="20"/>
-          <w:szCs w:val="20"/>
-        </w:rPr>
-        <w:t xml:space="preserve">Ilmiy-texnik dizayn mahsulotidan «BUYURTMACHI» faqat to'g'ridan-to'g'ri maqsadida foydalanadi. Ushbu mahsulotni «IJROCHI»ning yozma roziligisiz uchinchi shaxsga berish yoki boshqa obyekt uchun ishlatish taqiqlanadi.</w:t>
+        <w:t xml:space="preserve">«BUYURTMACHI» quyidagi xizmatlarni ishlab chiqishni «IJROCHI» zimmasiga yuklaydi va «IJROCHI» ushbu majburiyatlarni qabul qiladi: {manzil} manzili bo'yicha loyihalash va hujjatlarni hamrohlik qilish xizmatlari.</w:t>
+      </w:r>
+    </w:p>
+    <w:p>
+      <w:pPr>
+        <w:spacing w:after="60" w:line="240" w:lineRule="auto"/>
+        <w:jc w:val="both"/>
+        <w:rPr>
+          <w:rFonts w:ascii="Times New Roman" w:hAnsi="Times New Roman" w:cs="Times New Roman"/>
+          <w:sz w:val="20"/>
+          <w:szCs w:val="20"/>
+        </w:rPr>
+      </w:pPr>
+      <w:r>
+        <w:rPr>
+          <w:rFonts w:ascii="Times New Roman" w:hAnsi="Times New Roman" w:cs="Times New Roman"/>
+          <w:sz w:val="20"/>
+          <w:szCs w:val="20"/>
+        </w:rPr>
+        <w:t xml:space="preserve">Ishning mazmuni, qiymati va bajarilish muddatlari Shartnomaga ajralmas qism hisoblanadigan loyihalash topshirig'i hamda shartnomaviy narx bayonnomasi orqali belgilanadi.</w:t>
+      </w:r>
+    </w:p>
+    <w:p>
+      <w:pPr>
+        <w:spacing w:after="60" w:line="240" w:lineRule="auto"/>
+        <w:jc w:val="both"/>
+        <w:rPr>
+          <w:rFonts w:ascii="Times New Roman" w:hAnsi="Times New Roman" w:cs="Times New Roman"/>
+          <w:sz w:val="20"/>
+          <w:szCs w:val="20"/>
+        </w:rPr>
+      </w:pPr>
+      <w:r>
+        <w:rPr>
+          <w:rFonts w:ascii="Times New Roman" w:hAnsi="Times New Roman" w:cs="Times New Roman"/>
+          <w:sz w:val="20"/>
+          <w:szCs w:val="20"/>
+        </w:rPr>
+        <w:t xml:space="preserve">Ilmiy-texnik dizaynerlik mahsulotidan «BUYURTMACHI» tomonidan faqat bevosita maqsadda foydalaniladi. Ushbu mahsulotni «IJROCHI»ning yozma roziligisiz uchinchi shaxslarga berish yoki boshqa obyekt uchun foydalanish taqiqlanadi.</w:t>
       </w:r>
     </w:p>
     <w:p>
@@ -176,83 +176,83 @@
           <w:sz w:val="20"/>
           <w:szCs w:val="20"/>
         </w:rPr>
-        <w:t xml:space="preserve">2. SHARTNOMA QIYMATI VA HISOB-KITOB TARTIBI</w:t>
-      </w:r>
-    </w:p>
-    <w:p>
-      <w:pPr>
-        <w:spacing w:after="60" w:line="240" w:lineRule="auto"/>
-        <w:jc w:val="both"/>
-        <w:rPr>
-          <w:rFonts w:ascii="Times New Roman" w:hAnsi="Times New Roman" w:cs="Times New Roman"/>
-          <w:sz w:val="20"/>
-          <w:szCs w:val="20"/>
-        </w:rPr>
-      </w:pPr>
-      <w:r>
-        <w:rPr>
-          <w:rFonts w:ascii="Times New Roman" w:hAnsi="Times New Roman" w:cs="Times New Roman"/>
-          <w:sz w:val="20"/>
-          <w:szCs w:val="20"/>
-        </w:rPr>
-        <w:t xml:space="preserve">2.1. Shartnoma narxi to'g'risidagi bayonnomaga muvofiq ishlar qiymati tomonlar tomonidan {narx} so'm ({narx_sozda} so'm, QQSsiz) miqdorida belgilandi.</w:t>
-      </w:r>
-    </w:p>
-    <w:p>
-      <w:pPr>
-        <w:spacing w:after="60" w:line="240" w:lineRule="auto"/>
-        <w:jc w:val="both"/>
-        <w:rPr>
-          <w:rFonts w:ascii="Times New Roman" w:hAnsi="Times New Roman" w:cs="Times New Roman"/>
-          <w:sz w:val="20"/>
-          <w:szCs w:val="20"/>
-        </w:rPr>
-      </w:pPr>
-      <w:r>
-        <w:rPr>
-          <w:rFonts w:ascii="Times New Roman" w:hAnsi="Times New Roman" w:cs="Times New Roman"/>
-          <w:sz w:val="20"/>
-          <w:szCs w:val="20"/>
-        </w:rPr>
-        <w:t xml:space="preserve">2.2. Ushbu Shartnomaga muvofiq ilmiy-texnik mahsulot tushunchasiga kiruvchi ishlar va xizmatlar bajarilgani uchun «BUYURTMACHI» 10 bank kuni ichida «IJROCHI»ga {narx} so'm ({narx_sozda} so'm, QQSsiz) o'tkazadi. Shartnoma narxi bayonnomasi ushbu shartnomaning ajralmas qismidir.</w:t>
-      </w:r>
-    </w:p>
-    <w:p>
-      <w:pPr>
-        <w:spacing w:after="60" w:line="240" w:lineRule="auto"/>
-        <w:jc w:val="both"/>
-        <w:rPr>
-          <w:rFonts w:ascii="Times New Roman" w:hAnsi="Times New Roman" w:cs="Times New Roman"/>
-          <w:sz w:val="20"/>
-          <w:szCs w:val="20"/>
-        </w:rPr>
-      </w:pPr>
-      <w:r>
-        <w:rPr>
-          <w:rFonts w:ascii="Times New Roman" w:hAnsi="Times New Roman" w:cs="Times New Roman"/>
-          <w:sz w:val="20"/>
-          <w:szCs w:val="20"/>
-        </w:rPr>
-        <w:t xml:space="preserve">2.3. «BUYURTMACHI» shartnoma imzolangandan so'ng 10 kun ichida «IJROCHI»ning hisob raqamiga shartnoma summasining 100% miqdorida, ya'ni {narx} so'm ({narx_sozda} so'm, QQSsiz) avans to'lovini amalga oshirishni o'z zimmasiga oladi.</w:t>
-      </w:r>
-    </w:p>
-    <w:p>
-      <w:pPr>
-        <w:spacing w:after="60" w:line="240" w:lineRule="auto"/>
-        <w:jc w:val="both"/>
-        <w:rPr>
-          <w:rFonts w:ascii="Times New Roman" w:hAnsi="Times New Roman" w:cs="Times New Roman"/>
-          <w:sz w:val="20"/>
-          <w:szCs w:val="20"/>
-        </w:rPr>
-      </w:pPr>
-      <w:r>
-        <w:rPr>
-          <w:rFonts w:ascii="Times New Roman" w:hAnsi="Times New Roman" w:cs="Times New Roman"/>
-          <w:sz w:val="20"/>
-          <w:szCs w:val="20"/>
-        </w:rPr>
-        <w:t xml:space="preserve">2.4. «IJROCHI» loyiha ishlarini faqat avans uning hisob raqamiga tushgandan so'ng boshlaydi.</w:t>
+        <w:t xml:space="preserve">2. SHARTNOMA QIYMATI VA HISOB-KITOB QILISH TARTIBI</w:t>
+      </w:r>
+    </w:p>
+    <w:p>
+      <w:pPr>
+        <w:spacing w:after="60" w:line="240" w:lineRule="auto"/>
+        <w:jc w:val="both"/>
+        <w:rPr>
+          <w:rFonts w:ascii="Times New Roman" w:hAnsi="Times New Roman" w:cs="Times New Roman"/>
+          <w:sz w:val="20"/>
+          <w:szCs w:val="20"/>
+        </w:rPr>
+      </w:pPr>
+      <w:r>
+        <w:rPr>
+          <w:rFonts w:ascii="Times New Roman" w:hAnsi="Times New Roman" w:cs="Times New Roman"/>
+          <w:sz w:val="20"/>
+          <w:szCs w:val="20"/>
+        </w:rPr>
+        <w:t xml:space="preserve">2.1. Shartnoma narxi kelishuv bayonnomasiga muvofiq tomonlar tomonidan {narx} so'm ({narx_sozda} so'm, QQSiz) miqdorida belgilangan.</w:t>
+      </w:r>
+    </w:p>
+    <w:p>
+      <w:pPr>
+        <w:spacing w:after="60" w:line="240" w:lineRule="auto"/>
+        <w:jc w:val="both"/>
+        <w:rPr>
+          <w:rFonts w:ascii="Times New Roman" w:hAnsi="Times New Roman" w:cs="Times New Roman"/>
+          <w:sz w:val="20"/>
+          <w:szCs w:val="20"/>
+        </w:rPr>
+      </w:pPr>
+      <w:r>
+        <w:rPr>
+          <w:rFonts w:ascii="Times New Roman" w:hAnsi="Times New Roman" w:cs="Times New Roman"/>
+          <w:sz w:val="20"/>
+          <w:szCs w:val="20"/>
+        </w:rPr>
+        <w:t xml:space="preserve">2.2. Ushbu Shartnomaga muvofiq ilmiy-texnik mahsulot tushunchasiga kiruvchi ish va xizmatlarni bajargani uchun «BUYURTMACHI» shartnomaviy narx kelishuv bayonnomasiga muvofiq {narx} so'm ({narx_sozda} so'm, QQSiz) miqdordagi mablag'ni 10 (o'n) bank kuni mobaynida «IJROCHI»ga o'tkazib beradi. Shartnomaviy narx kelishuv bayonnomasi ushbu shartnomaning ajralmas qismi hisoblanadi.</w:t>
+      </w:r>
+    </w:p>
+    <w:p>
+      <w:pPr>
+        <w:spacing w:after="60" w:line="240" w:lineRule="auto"/>
+        <w:jc w:val="both"/>
+        <w:rPr>
+          <w:rFonts w:ascii="Times New Roman" w:hAnsi="Times New Roman" w:cs="Times New Roman"/>
+          <w:sz w:val="20"/>
+          <w:szCs w:val="20"/>
+        </w:rPr>
+      </w:pPr>
+      <w:r>
+        <w:rPr>
+          <w:rFonts w:ascii="Times New Roman" w:hAnsi="Times New Roman" w:cs="Times New Roman"/>
+          <w:sz w:val="20"/>
+          <w:szCs w:val="20"/>
+        </w:rPr>
+        <w:t xml:space="preserve">2.3. «BUYURTMACHI» shartnoma imzolangandan keyin 10 kunlik muddat ichida Shartnoma summasining 100% miqdorida, ya'ni {narx} so'm ({narx_sozda} so'm, QQSiz) miqdoridagi avans oldindan to'lovini «IJROCHI»ning hisob raqamiga o'tkazib berish majburiyatini oladi.</w:t>
+      </w:r>
+    </w:p>
+    <w:p>
+      <w:pPr>
+        <w:spacing w:after="60" w:line="240" w:lineRule="auto"/>
+        <w:jc w:val="both"/>
+        <w:rPr>
+          <w:rFonts w:ascii="Times New Roman" w:hAnsi="Times New Roman" w:cs="Times New Roman"/>
+          <w:sz w:val="20"/>
+          <w:szCs w:val="20"/>
+        </w:rPr>
+      </w:pPr>
+      <w:r>
+        <w:rPr>
+          <w:rFonts w:ascii="Times New Roman" w:hAnsi="Times New Roman" w:cs="Times New Roman"/>
+          <w:sz w:val="20"/>
+          <w:szCs w:val="20"/>
+        </w:rPr>
+        <w:t xml:space="preserve">2.4. «IJROCHI» loyiha ishlarini ishlab chiqishga faqatgina avans mablag'i uning hisob raqamiga tushganidan keyingina kirishadi.</w:t>
       </w:r>
     </w:p>
     <w:p>
@@ -292,45 +292,64 @@
           <w:sz w:val="20"/>
           <w:szCs w:val="20"/>
         </w:rPr>
-        <w:t xml:space="preserve">3.1. Ishlar tugagach «IJROCHI» «BUYURTMACHI»ga Shartnoma shartlarida ko'zda tutilgan ilmiy-texnik va boshqa hujjatlar to'plami ilova qilingan holda ilmiy-texnik hujjatlarni qabul-topshirish dalolatnomasini taqdim etadi.</w:t>
-      </w:r>
-    </w:p>
-    <w:p>
-      <w:pPr>
-        <w:spacing w:after="60" w:line="240" w:lineRule="auto"/>
-        <w:jc w:val="both"/>
-        <w:rPr>
-          <w:rFonts w:ascii="Times New Roman" w:hAnsi="Times New Roman" w:cs="Times New Roman"/>
-          <w:sz w:val="20"/>
-          <w:szCs w:val="20"/>
-        </w:rPr>
-      </w:pPr>
-      <w:r>
-        <w:rPr>
-          <w:rFonts w:ascii="Times New Roman" w:hAnsi="Times New Roman" w:cs="Times New Roman"/>
-          <w:sz w:val="20"/>
-          <w:szCs w:val="20"/>
-        </w:rPr>
-        <w:t xml:space="preserve">3.2. «BUYURTMACHI» qabul-topshirish dalolatnomasini va unga ilova qilingan hujjatlarni olgan kundan boshlab 5 kun ichida «IJROCHI»ga imzolangan dalolatnomani yoki ishlarni qabul qilishdan asoslangan rad javobini yuborishi shart.</w:t>
-      </w:r>
-    </w:p>
-    <w:p>
-      <w:pPr>
-        <w:spacing w:after="60" w:line="240" w:lineRule="auto"/>
-        <w:jc w:val="both"/>
-        <w:rPr>
-          <w:rFonts w:ascii="Times New Roman" w:hAnsi="Times New Roman" w:cs="Times New Roman"/>
-          <w:sz w:val="20"/>
-          <w:szCs w:val="20"/>
-        </w:rPr>
-      </w:pPr>
-      <w:r>
-        <w:rPr>
-          <w:rFonts w:ascii="Times New Roman" w:hAnsi="Times New Roman" w:cs="Times New Roman"/>
-          <w:sz w:val="20"/>
-          <w:szCs w:val="20"/>
-        </w:rPr>
-        <w:t xml:space="preserve">3.3. «BUYURTMACHI» asoslangan rad javobini bergan taqdirda, tomonlar 10 kun ichida zarur tuzatishlar ro'yxati va ularni bajarish muddatlari ko'rsatilgan ikki tomonlama dalolatnoma tuzadilar.</w:t>
+        <w:t xml:space="preserve">3.1. Ishlar tugallangandan so'ng «IJROCHI» «BUYURTMACHI»ga Shartnoma shartlarida nazarda tutilgan ilmiy-texnik va boshqa hujjatlar to'plamini ilova qilgan holda, ilmiy-texnik hujjatlarni topshirish-qabul qilish dalolatnomasini taqdim etadi.</w:t>
+      </w:r>
+    </w:p>
+    <w:p>
+      <w:pPr>
+        <w:spacing w:after="60" w:line="240" w:lineRule="auto"/>
+        <w:jc w:val="both"/>
+        <w:rPr>
+          <w:rFonts w:ascii="Times New Roman" w:hAnsi="Times New Roman" w:cs="Times New Roman"/>
+          <w:sz w:val="20"/>
+          <w:szCs w:val="20"/>
+        </w:rPr>
+      </w:pPr>
+      <w:r>
+        <w:rPr>
+          <w:rFonts w:ascii="Times New Roman" w:hAnsi="Times New Roman" w:cs="Times New Roman"/>
+          <w:sz w:val="20"/>
+          <w:szCs w:val="20"/>
+        </w:rPr>
+        <w:t xml:space="preserve">3.2. «BUYURTMACHI» topshirish-qabul qilish dalolatnomasi va ushbu Shartnomaning 3.1-bandida ko'rsatilgan unga ilova qilingan hujjatlarni olgan kundan boshlab 5 kun ichida «IJROCHI»ga imzolangan ishni topshirish-qabul qilish dalolatnomasini yoki ishni qabul qilishdan asoslantirilgan rad javobini yuborishi shart.</w:t>
+      </w:r>
+    </w:p>
+    <w:p>
+      <w:pPr>
+        <w:spacing w:after="60" w:line="240" w:lineRule="auto"/>
+        <w:jc w:val="both"/>
+        <w:rPr>
+          <w:rFonts w:ascii="Times New Roman" w:hAnsi="Times New Roman" w:cs="Times New Roman"/>
+          <w:sz w:val="20"/>
+          <w:szCs w:val="20"/>
+        </w:rPr>
+      </w:pPr>
+      <w:r>
+        <w:rPr>
+          <w:rFonts w:ascii="Times New Roman" w:hAnsi="Times New Roman" w:cs="Times New Roman"/>
+          <w:sz w:val="20"/>
+          <w:szCs w:val="20"/>
+        </w:rPr>
+        <w:t xml:space="preserve">3.3. «BUYURTMACHI» tomonidan asoslantirilgan rad javobi berilgan taqdirda, tomonlar 10 kunlik muddat ichida tomonlarning mas'ul vakillarining imzolari bilan rasmiylashtirilgan, zarur kamchiliklarni bartaraf etish ro'yxati va ularni bajarish muddatlari ko'rsatilgan ikki tomonlama dalolatnoma tuzadilar.</w:t>
+      </w:r>
+    </w:p>
+    <w:p>
+      <w:pPr>
+        <w:spacing w:after="60" w:line="240" w:lineRule="auto"/>
+        <w:jc w:val="both"/>
+        <w:rPr>
+          <w:rFonts w:ascii="Times New Roman" w:hAnsi="Times New Roman" w:cs="Times New Roman"/>
+          <w:sz w:val="20"/>
+          <w:szCs w:val="20"/>
+        </w:rPr>
+      </w:pPr>
+      <w:r>
+        <w:rPr>
+          <w:rFonts w:ascii="Times New Roman" w:hAnsi="Times New Roman" w:cs="Times New Roman"/>
+          <w:sz w:val="20"/>
+          <w:szCs w:val="20"/>
+        </w:rPr>
+        <w:t xml:space="preserve">3.4. Agar ishlar va xizmatlarni bajarish jarayonida uni keyinchalik davom ettirish maqsadga muvofiq emasligi aniqlansa, «IJROCHI» bu haqda «BUYURTMACHI»ni xabardor qilgan holda ularni to'xtatib turishga majburdir. «BUYURTMACHI» 5 kunlik muddat ichida ishni to'xtatib turish masalasini ko'rib chiqishi shart. Bunday holda tomonlar 10 kunlik muddat ichida xizmatlarni davom ettirish maqsadga muvofiqligi yoki ishni to'xtatish va o'zaro hisob-kitob qilish dalolatnomalarini tuzish masalasini ko'rib chiqishga majburdirlar.</w:t>
       </w:r>
     </w:p>
     <w:p>
@@ -370,45 +389,64 @@
           <w:sz w:val="20"/>
           <w:szCs w:val="20"/>
         </w:rPr>
-        <w:t xml:space="preserve">4.1. Ushbu Shartnoma bo'yicha majburiyatlar bajarilmagan yoki lozim darajada bajarilmagan taqdirda «IJROCHI» va «BUYURTMACHI» amaldagi qonunchilikka muvofiq va shartnoma summasidan oshmagan miqdorda mulkiy javobgarlik yuritadilar.</w:t>
-      </w:r>
-    </w:p>
-    <w:p>
-      <w:pPr>
-        <w:spacing w:after="60" w:line="240" w:lineRule="auto"/>
-        <w:jc w:val="both"/>
-        <w:rPr>
-          <w:rFonts w:ascii="Times New Roman" w:hAnsi="Times New Roman" w:cs="Times New Roman"/>
-          <w:sz w:val="20"/>
-          <w:szCs w:val="20"/>
-        </w:rPr>
-      </w:pPr>
-      <w:r>
-        <w:rPr>
-          <w:rFonts w:ascii="Times New Roman" w:hAnsi="Times New Roman" w:cs="Times New Roman"/>
-          <w:sz w:val="20"/>
-          <w:szCs w:val="20"/>
-        </w:rPr>
-        <w:t xml:space="preserve">4.2. «BUYURTMACHI» taqdim etilayotgan dastlabki ma'lumotlarning to'liqligi va ishonchliligi uchun javobgar.</w:t>
-      </w:r>
-    </w:p>
-    <w:p>
-      <w:pPr>
-        <w:spacing w:after="60" w:line="240" w:lineRule="auto"/>
-        <w:jc w:val="both"/>
-        <w:rPr>
-          <w:rFonts w:ascii="Times New Roman" w:hAnsi="Times New Roman" w:cs="Times New Roman"/>
-          <w:sz w:val="20"/>
-          <w:szCs w:val="20"/>
-        </w:rPr>
-      </w:pPr>
-      <w:r>
-        <w:rPr>
-          <w:rFonts w:ascii="Times New Roman" w:hAnsi="Times New Roman" w:cs="Times New Roman"/>
-          <w:sz w:val="20"/>
-          <w:szCs w:val="20"/>
-        </w:rPr>
-        <w:t xml:space="preserve">4.3. «IJROCHI» loyihalash topshirig'ida belgilangan shartlarning bajarilishi uchun javobgar.</w:t>
+        <w:t xml:space="preserve">4.1. «IJROCHI» va «BUYURTMACHI» ushbu Shartnomaning majburiyatlarini bajarmaganlik yoki lozim darajada bajarmaganlik uchun amaldagi qonunchilikka muvofiq va shartnoma summasidan oshmaydigan miqdorda mulkiy javobgarlikni o'z zimmalariga oladilar.</w:t>
+      </w:r>
+    </w:p>
+    <w:p>
+      <w:pPr>
+        <w:spacing w:after="60" w:line="240" w:lineRule="auto"/>
+        <w:jc w:val="both"/>
+        <w:rPr>
+          <w:rFonts w:ascii="Times New Roman" w:hAnsi="Times New Roman" w:cs="Times New Roman"/>
+          <w:sz w:val="20"/>
+          <w:szCs w:val="20"/>
+        </w:rPr>
+      </w:pPr>
+      <w:r>
+        <w:rPr>
+          <w:rFonts w:ascii="Times New Roman" w:hAnsi="Times New Roman" w:cs="Times New Roman"/>
+          <w:sz w:val="20"/>
+          <w:szCs w:val="20"/>
+        </w:rPr>
+        <w:t xml:space="preserve">4.2. Shartnoma bo'yicha o'z majburiyatlarini vicdonan bajarmaganlik uchun aybdor tomonga O'zbekiston Respublikasining 1998-yil 29-avgustdagi «Xo'jalik yurituvchi subyektlar faoliyatining shartnomaviy-huquqiy bazasi to'g'risida»gi Qonunida nazarda tutilgan normalar va sanksiyalar qo'llaniladi.</w:t>
+      </w:r>
+    </w:p>
+    <w:p>
+      <w:pPr>
+        <w:spacing w:after="60" w:line="240" w:lineRule="auto"/>
+        <w:jc w:val="both"/>
+        <w:rPr>
+          <w:rFonts w:ascii="Times New Roman" w:hAnsi="Times New Roman" w:cs="Times New Roman"/>
+          <w:sz w:val="20"/>
+          <w:szCs w:val="20"/>
+        </w:rPr>
+      </w:pPr>
+      <w:r>
+        <w:rPr>
+          <w:rFonts w:ascii="Times New Roman" w:hAnsi="Times New Roman" w:cs="Times New Roman"/>
+          <w:sz w:val="20"/>
+          <w:szCs w:val="20"/>
+        </w:rPr>
+        <w:t xml:space="preserve">4.3. «BUYURTMACHI» taqdim etilayotgan dastlabki ma'lumotlarning to'liqligi va haqqoniyligi uchun javobgardir.</w:t>
+      </w:r>
+    </w:p>
+    <w:p>
+      <w:pPr>
+        <w:spacing w:after="60" w:line="240" w:lineRule="auto"/>
+        <w:jc w:val="both"/>
+        <w:rPr>
+          <w:rFonts w:ascii="Times New Roman" w:hAnsi="Times New Roman" w:cs="Times New Roman"/>
+          <w:sz w:val="20"/>
+          <w:szCs w:val="20"/>
+        </w:rPr>
+      </w:pPr>
+      <w:r>
+        <w:rPr>
+          <w:rFonts w:ascii="Times New Roman" w:hAnsi="Times New Roman" w:cs="Times New Roman"/>
+          <w:sz w:val="20"/>
+          <w:szCs w:val="20"/>
+        </w:rPr>
+        <w:t xml:space="preserve">4.4. «IJROCHI» loyihalash topshirig'ida ko'rsatilgan shartlarning bajarilishi uchun javobgardir.</w:t>
       </w:r>
     </w:p>
     <w:p>
@@ -448,83 +486,197 @@
           <w:sz w:val="20"/>
           <w:szCs w:val="20"/>
         </w:rPr>
-        <w:t xml:space="preserve">5.1. Shartnoma «IJROCHI» avans o'tkazilgani to'g'risida xabar olgach va «BUYURTMACHI» dastlabki ma'lumotlarni bergach kuchga kiradi.</w:t>
-      </w:r>
-    </w:p>
-    <w:p>
-      <w:pPr>
-        <w:spacing w:after="60" w:line="240" w:lineRule="auto"/>
-        <w:jc w:val="both"/>
-        <w:rPr>
-          <w:rFonts w:ascii="Times New Roman" w:hAnsi="Times New Roman" w:cs="Times New Roman"/>
-          <w:sz w:val="20"/>
-          <w:szCs w:val="20"/>
-        </w:rPr>
-      </w:pPr>
-      <w:r>
-        <w:rPr>
-          <w:rFonts w:ascii="Times New Roman" w:hAnsi="Times New Roman" w:cs="Times New Roman"/>
-          <w:sz w:val="20"/>
-          <w:szCs w:val="20"/>
-        </w:rPr>
-        <w:t xml:space="preserve">5.2. Avans yuqorida ko'rsatilgan muddatda (2.2-band) tushmagan taqdirda «IJROCHI» Shartnomani bir tomonlama bekor qilish huquqiga ega.</w:t>
-      </w:r>
-    </w:p>
-    <w:p>
-      <w:pPr>
-        <w:spacing w:after="60" w:line="240" w:lineRule="auto"/>
-        <w:jc w:val="both"/>
-        <w:rPr>
-          <w:rFonts w:ascii="Times New Roman" w:hAnsi="Times New Roman" w:cs="Times New Roman"/>
-          <w:sz w:val="20"/>
-          <w:szCs w:val="20"/>
-        </w:rPr>
-      </w:pPr>
-      <w:r>
-        <w:rPr>
-          <w:rFonts w:ascii="Times New Roman" w:hAnsi="Times New Roman" w:cs="Times New Roman"/>
-          <w:sz w:val="20"/>
-          <w:szCs w:val="20"/>
-        </w:rPr>
-        <w:t xml:space="preserve">5.3. Boshqa hollarda Shartnoma tomonlar kelishuviga ko'ra yoki sud qaroriga binoan o'zgartirilishi yoki bekor qilinishi mumkin.</w:t>
-      </w:r>
-    </w:p>
-    <w:p>
-      <w:pPr>
-        <w:spacing w:after="60" w:line="240" w:lineRule="auto"/>
-        <w:jc w:val="both"/>
-        <w:rPr>
-          <w:rFonts w:ascii="Times New Roman" w:hAnsi="Times New Roman" w:cs="Times New Roman"/>
-          <w:sz w:val="20"/>
-          <w:szCs w:val="20"/>
-        </w:rPr>
-      </w:pPr>
-      <w:r>
-        <w:rPr>
-          <w:rFonts w:ascii="Times New Roman" w:hAnsi="Times New Roman" w:cs="Times New Roman"/>
-          <w:sz w:val="20"/>
-          <w:szCs w:val="20"/>
-        </w:rPr>
-        <w:t xml:space="preserve">5.10. Ushbu shartnoma bo'yicha barcha nizo va kelishmovchiliklar tomonlar tomonidan muzokaralar yo'li bilan hal etiladi. Kelishuvga erishilmagan taqdirda, har bir tomon buzilgan huquqlarni himoya qilish uchun sud organlariga murojaat qilish huquqiga ega.</w:t>
-      </w:r>
-    </w:p>
-    <w:p>
-      <w:pPr>
-        <w:spacing w:after="60" w:line="240" w:lineRule="auto"/>
-        <w:jc w:val="both"/>
-        <w:rPr>
-          <w:rFonts w:ascii="Times New Roman" w:hAnsi="Times New Roman" w:cs="Times New Roman"/>
-          <w:sz w:val="20"/>
-          <w:szCs w:val="20"/>
-        </w:rPr>
-      </w:pPr>
-      <w:r>
-        <w:rPr>
-          <w:rFonts w:ascii="Times New Roman" w:hAnsi="Times New Roman" w:cs="Times New Roman"/>
-          <w:sz w:val="20"/>
-          <w:szCs w:val="20"/>
-        </w:rPr>
-        <w:t xml:space="preserve">5.11. Ushbu Shartnoma imzolangan paytdan to tomonlar majburiyatlarini to'liq bajargunga qadar amal qiladi.</w:t>
+        <w:t xml:space="preserve">5.1. Shartnoma «IJROCHI» tomonidan avans mablag'i o'tkazilganligi haqidagi xabarnoma olingandan va «BUYURTMACHI» tomonidan dastlabki ma'lumotlar taqdim etilgandan keyin kuchga kiradi.</w:t>
+      </w:r>
+    </w:p>
+    <w:p>
+      <w:pPr>
+        <w:spacing w:after="60" w:line="240" w:lineRule="auto"/>
+        <w:jc w:val="both"/>
+        <w:rPr>
+          <w:rFonts w:ascii="Times New Roman" w:hAnsi="Times New Roman" w:cs="Times New Roman"/>
+          <w:sz w:val="20"/>
+          <w:szCs w:val="20"/>
+        </w:rPr>
+      </w:pPr>
+      <w:r>
+        <w:rPr>
+          <w:rFonts w:ascii="Times New Roman" w:hAnsi="Times New Roman" w:cs="Times New Roman"/>
+          <w:sz w:val="20"/>
+          <w:szCs w:val="20"/>
+        </w:rPr>
+        <w:t xml:space="preserve">5.2. Yuqorida ko'rsatilgan muddatda (2.2-band) avans mablag'i tushmagan taqdirda, «IJROCHI» Shartnomani bir tomonlama tartibda bekor qilishga haqlidir.</w:t>
+      </w:r>
+    </w:p>
+    <w:p>
+      <w:pPr>
+        <w:spacing w:after="60" w:line="240" w:lineRule="auto"/>
+        <w:jc w:val="both"/>
+        <w:rPr>
+          <w:rFonts w:ascii="Times New Roman" w:hAnsi="Times New Roman" w:cs="Times New Roman"/>
+          <w:sz w:val="20"/>
+          <w:szCs w:val="20"/>
+        </w:rPr>
+      </w:pPr>
+      <w:r>
+        <w:rPr>
+          <w:rFonts w:ascii="Times New Roman" w:hAnsi="Times New Roman" w:cs="Times New Roman"/>
+          <w:sz w:val="20"/>
+          <w:szCs w:val="20"/>
+        </w:rPr>
+        <w:t xml:space="preserve">5.3. Boshqa hollarda Shartnoma tomonlarning kelishuviga ko'ra yoki sud qaroriga binoan o'zgartirilishi yoki bekor qilinishi mumkin.</w:t>
+      </w:r>
+    </w:p>
+    <w:p>
+      <w:pPr>
+        <w:spacing w:after="60" w:line="240" w:lineRule="auto"/>
+        <w:jc w:val="both"/>
+        <w:rPr>
+          <w:rFonts w:ascii="Times New Roman" w:hAnsi="Times New Roman" w:cs="Times New Roman"/>
+          <w:sz w:val="20"/>
+          <w:szCs w:val="20"/>
+        </w:rPr>
+      </w:pPr>
+      <w:r>
+        <w:rPr>
+          <w:rFonts w:ascii="Times New Roman" w:hAnsi="Times New Roman" w:cs="Times New Roman"/>
+          <w:sz w:val="20"/>
+          <w:szCs w:val="20"/>
+        </w:rPr>
+        <w:t xml:space="preserve">5.4. Agar «BUYURTMACHI» Shartnomani to'xtatsa, u ishlar to'xtatilgan kunga qadar bajarilgan ishlar hajmini to'lab berishga majburdir.</w:t>
+      </w:r>
+    </w:p>
+    <w:p>
+      <w:pPr>
+        <w:spacing w:after="60" w:line="240" w:lineRule="auto"/>
+        <w:jc w:val="both"/>
+        <w:rPr>
+          <w:rFonts w:ascii="Times New Roman" w:hAnsi="Times New Roman" w:cs="Times New Roman"/>
+          <w:sz w:val="20"/>
+          <w:szCs w:val="20"/>
+        </w:rPr>
+      </w:pPr>
+      <w:r>
+        <w:rPr>
+          <w:rFonts w:ascii="Times New Roman" w:hAnsi="Times New Roman" w:cs="Times New Roman"/>
+          <w:sz w:val="20"/>
+          <w:szCs w:val="20"/>
+        </w:rPr>
+        <w:t xml:space="preserve">5.5. Qo'shimcha xarajatlarni keltirib chiqaradigan dizayn xizmatlari hajmi oshgan taqdirda, «BUYURTMACHI» qo'shimcha to'lovni amalga oshiradi.</w:t>
+      </w:r>
+    </w:p>
+    <w:p>
+      <w:pPr>
+        <w:spacing w:after="60" w:line="240" w:lineRule="auto"/>
+        <w:jc w:val="both"/>
+        <w:rPr>
+          <w:rFonts w:ascii="Times New Roman" w:hAnsi="Times New Roman" w:cs="Times New Roman"/>
+          <w:sz w:val="20"/>
+          <w:szCs w:val="20"/>
+        </w:rPr>
+      </w:pPr>
+      <w:r>
+        <w:rPr>
+          <w:rFonts w:ascii="Times New Roman" w:hAnsi="Times New Roman" w:cs="Times New Roman"/>
+          <w:sz w:val="20"/>
+          <w:szCs w:val="20"/>
+        </w:rPr>
+        <w:t xml:space="preserve">5.6. Shartnoma bo'yicha ishlar (xizmatlar)ni bajarish uchun zarur bo'lgan dastlabki ma'lumotlarni taqdim etish 20 kundan ortiq muddatga kechiktirilganda, «IJROCHI» «BUYURTMACHI»ga ishni to'xtatish dalolatnomasini taqdim etgan holda Shartnomani bir tomonlama tartibda bekor qilishga haqlidir.</w:t>
+      </w:r>
+    </w:p>
+    <w:p>
+      <w:pPr>
+        <w:spacing w:after="60" w:line="240" w:lineRule="auto"/>
+        <w:jc w:val="both"/>
+        <w:rPr>
+          <w:rFonts w:ascii="Times New Roman" w:hAnsi="Times New Roman" w:cs="Times New Roman"/>
+          <w:sz w:val="20"/>
+          <w:szCs w:val="20"/>
+        </w:rPr>
+      </w:pPr>
+      <w:r>
+        <w:rPr>
+          <w:rFonts w:ascii="Times New Roman" w:hAnsi="Times New Roman" w:cs="Times New Roman"/>
+          <w:sz w:val="20"/>
+          <w:szCs w:val="20"/>
+        </w:rPr>
+        <w:t xml:space="preserve">5.7. Shartnoma narxi ochiq hisoblanadi va energiya resurslari, materiallar, mehnat haqi shartlari hamda bazaviy narxda hisobga olinmagan boshqa xarajatlar narxlari o'zgarganda aniqlashtirilishi mumkin.</w:t>
+      </w:r>
+    </w:p>
+    <w:p>
+      <w:pPr>
+        <w:spacing w:after="60" w:line="240" w:lineRule="auto"/>
+        <w:jc w:val="both"/>
+        <w:rPr>
+          <w:rFonts w:ascii="Times New Roman" w:hAnsi="Times New Roman" w:cs="Times New Roman"/>
+          <w:sz w:val="20"/>
+          <w:szCs w:val="20"/>
+        </w:rPr>
+      </w:pPr>
+      <w:r>
+        <w:rPr>
+          <w:rFonts w:ascii="Times New Roman" w:hAnsi="Times New Roman" w:cs="Times New Roman"/>
+          <w:sz w:val="20"/>
+          <w:szCs w:val="20"/>
+        </w:rPr>
+        <w:t xml:space="preserve">5.8. Bajarilgan ishlar o'z vaqtida to'lanmaganda, «BUYURTMACHI» tomonidan ushbu Shartnoma bo'yicha kelishilgan narx hamda to'lov vaqtidagi indeksatsiya qilingan narx o'rtasidagi farqqa teng qo'shimcha to'lov amalga oshiriladi.</w:t>
+      </w:r>
+    </w:p>
+    <w:p>
+      <w:pPr>
+        <w:spacing w:after="60" w:line="240" w:lineRule="auto"/>
+        <w:jc w:val="both"/>
+        <w:rPr>
+          <w:rFonts w:ascii="Times New Roman" w:hAnsi="Times New Roman" w:cs="Times New Roman"/>
+          <w:sz w:val="20"/>
+          <w:szCs w:val="20"/>
+        </w:rPr>
+      </w:pPr>
+      <w:r>
+        <w:rPr>
+          <w:rFonts w:ascii="Times New Roman" w:hAnsi="Times New Roman" w:cs="Times New Roman"/>
+          <w:sz w:val="20"/>
+          <w:szCs w:val="20"/>
+        </w:rPr>
+        <w:t xml:space="preserve">5.9. «BUYURTMACHI» tomonidan ishlab chiqilgan dizayn hujjatlarini «IJROCHI»ning roziligisiz boshqalarga berish taqiqlanadi.</w:t>
+      </w:r>
+    </w:p>
+    <w:p>
+      <w:pPr>
+        <w:spacing w:after="60" w:line="240" w:lineRule="auto"/>
+        <w:jc w:val="both"/>
+        <w:rPr>
+          <w:rFonts w:ascii="Times New Roman" w:hAnsi="Times New Roman" w:cs="Times New Roman"/>
+          <w:sz w:val="20"/>
+          <w:szCs w:val="20"/>
+        </w:rPr>
+      </w:pPr>
+      <w:r>
+        <w:rPr>
+          <w:rFonts w:ascii="Times New Roman" w:hAnsi="Times New Roman" w:cs="Times New Roman"/>
+          <w:sz w:val="20"/>
+          <w:szCs w:val="20"/>
+        </w:rPr>
+        <w:t xml:space="preserve">5.10. Ushbu shartnoma bo'yicha barcha nizolar va kelishmovchiliklar tomonlar o'rtasida muzokaralar olib borish yo'li bilan hal etiladi. Kelishuvga erishilmagan taqdirda, har qanday tomon buzilgan huquqlarini himoya qilish uchun sud organlariga murojaat qilishga haqli.</w:t>
+      </w:r>
+    </w:p>
+    <w:p>
+      <w:pPr>
+        <w:spacing w:after="60" w:line="240" w:lineRule="auto"/>
+        <w:jc w:val="both"/>
+        <w:rPr>
+          <w:rFonts w:ascii="Times New Roman" w:hAnsi="Times New Roman" w:cs="Times New Roman"/>
+          <w:sz w:val="20"/>
+          <w:szCs w:val="20"/>
+        </w:rPr>
+      </w:pPr>
+      <w:r>
+        <w:rPr>
+          <w:rFonts w:ascii="Times New Roman" w:hAnsi="Times New Roman" w:cs="Times New Roman"/>
+          <w:sz w:val="20"/>
+          <w:szCs w:val="20"/>
+        </w:rPr>
+        <w:t xml:space="preserve">5.11. Ushbu Shartnomaning amal qilish muddati u imzolangan paytdan boshlab tomonlar Shartnoma bo'yicha qabul qilingan majburiyatlarni to'liq bajarguniga qadar etib belgilanadi.</w:t>
       </w:r>
     </w:p>
     <w:p>
@@ -545,7 +697,125 @@
           <w:sz w:val="20"/>
           <w:szCs w:val="20"/>
         </w:rPr>
-        <w:t xml:space="preserve">8. TOMONLARNING MANZIL VA REKVIZITLARI</w:t>
+        <w:t xml:space="preserve">6. FORS-MAJOR HOLATLARI</w:t>
+      </w:r>
+    </w:p>
+    <w:p>
+      <w:pPr>
+        <w:spacing w:after="60" w:line="240" w:lineRule="auto"/>
+        <w:jc w:val="both"/>
+        <w:rPr>
+          <w:rFonts w:ascii="Times New Roman" w:hAnsi="Times New Roman" w:cs="Times New Roman"/>
+          <w:sz w:val="20"/>
+          <w:szCs w:val="20"/>
+        </w:rPr>
+      </w:pPr>
+      <w:r>
+        <w:rPr>
+          <w:rFonts w:ascii="Times New Roman" w:hAnsi="Times New Roman" w:cs="Times New Roman"/>
+          <w:sz w:val="20"/>
+          <w:szCs w:val="20"/>
+        </w:rPr>
+        <w:t xml:space="preserve">6.1. Tomonlar fors-major holatlari (tabiiy ofatlar, suv toshqinlari, yong'inlar, shuningdek, davlat organlarining hujjatlari, harbiy harakatlar) yuzaga kelganda javobgar bo'lmaydilar. Fors-major holatlari yuzaga kelganda tomonlar bunday holatlar boshlangan paytdan e'tiboran 3 kun ichida bir-birlarini xabardor qilishga majburdirlar.</w:t>
+      </w:r>
+    </w:p>
+    <w:p>
+      <w:pPr>
+        <w:spacing w:after="60" w:line="240" w:lineRule="auto"/>
+        <w:jc w:val="both"/>
+        <w:rPr>
+          <w:rFonts w:ascii="Times New Roman" w:hAnsi="Times New Roman" w:cs="Times New Roman"/>
+          <w:sz w:val="20"/>
+          <w:szCs w:val="20"/>
+        </w:rPr>
+      </w:pPr>
+      <w:r>
+        <w:rPr>
+          <w:rFonts w:ascii="Times New Roman" w:hAnsi="Times New Roman" w:cs="Times New Roman"/>
+          <w:sz w:val="20"/>
+          <w:szCs w:val="20"/>
+        </w:rPr>
+        <w:t xml:space="preserve">6.2. Fors-major holatlari bo'yicha yuqorida ko'rsatilgan shartlar bajarilmagan taqdirda, tomonlar ushbu shartnoma bo'yicha javobgarlikdan ozod qilinmaydilar. Shartnomaning 6.1-bandida oldindan ko'rsatilgan fors-major holatlari muddati tugaganidan so'ng, Ijrochi ishlarni yakunlash va shartnoma bo'yicha qabul qilingan majburiyatlarni oxiriga yetkazishga majburdir. Shartnoma muddati fors-major holatlari amal qilgan davrga muvofiq uzaytiriladi.</w:t>
+      </w:r>
+    </w:p>
+    <w:p>
+      <w:pPr>
+        <w:spacing w:after="60" w:line="240" w:lineRule="auto"/>
+        <w:jc w:val="both"/>
+        <w:rPr>
+          <w:rFonts w:ascii="Times New Roman" w:hAnsi="Times New Roman" w:cs="Times New Roman"/>
+          <w:sz w:val="20"/>
+          <w:szCs w:val="20"/>
+        </w:rPr>
+      </w:pPr>
+      <w:r>
+        <w:rPr>
+          <w:rFonts w:ascii="Times New Roman" w:hAnsi="Times New Roman" w:cs="Times New Roman"/>
+          <w:sz w:val="20"/>
+          <w:szCs w:val="20"/>
+        </w:rPr>
+        <w:t xml:space="preserve">6.3. Fors-major tufayli o'z majburiyatlarini uch oy mobaynida bajarish imkoniyati bo'lmagan taqdirda, ushbu shartnoma bajarilgan ishlar dalolatnomasini tuzgan holda tomonlardan har qanday birining tashabbusi bilan bekor qilinishi mumkin.</w:t>
+      </w:r>
+    </w:p>
+    <w:p>
+      <w:pPr>
+        <w:spacing w:after="80" w:line="240" w:lineRule="auto"/>
+        <w:jc w:val="center"/>
+        <w:rPr>
+          <w:rFonts w:ascii="Times New Roman" w:hAnsi="Times New Roman" w:cs="Times New Roman"/>
+          <w:b/>
+          <w:sz w:val="20"/>
+          <w:szCs w:val="20"/>
+        </w:rPr>
+      </w:pPr>
+      <w:r>
+        <w:rPr>
+          <w:rFonts w:ascii="Times New Roman" w:hAnsi="Times New Roman" w:cs="Times New Roman"/>
+          <w:b/>
+          <w:sz w:val="20"/>
+          <w:szCs w:val="20"/>
+        </w:rPr>
+        <w:t xml:space="preserve">7. YAKUNIY QOIDALAR</w:t>
+      </w:r>
+    </w:p>
+    <w:p>
+      <w:pPr>
+        <w:spacing w:after="60" w:line="240" w:lineRule="auto"/>
+        <w:jc w:val="both"/>
+        <w:rPr>
+          <w:rFonts w:ascii="Times New Roman" w:hAnsi="Times New Roman" w:cs="Times New Roman"/>
+          <w:sz w:val="20"/>
+          <w:szCs w:val="20"/>
+        </w:rPr>
+      </w:pPr>
+      <w:r>
+        <w:rPr>
+          <w:rFonts w:ascii="Times New Roman" w:hAnsi="Times New Roman" w:cs="Times New Roman"/>
+          <w:sz w:val="20"/>
+          <w:szCs w:val="20"/>
+        </w:rPr>
+        <w:t xml:space="preserve">7.1. Ushbu shartnoma bir xil yuridik kuchga ega bo'lgan ikki nusxada, har bir tomon uchun bir nusxadan tuzildi. Ushbu shartnomaga shartnomaviy narx kelishuv bayonnomasi ilova qilinadi.</w:t>
+      </w:r>
+    </w:p>
+    <w:p>
+      <w:pPr>
+        <w:spacing w:after="80" w:line="240" w:lineRule="auto"/>
+        <w:jc w:val="center"/>
+        <w:rPr>
+          <w:rFonts w:ascii="Times New Roman" w:hAnsi="Times New Roman" w:cs="Times New Roman"/>
+          <w:b/>
+          <w:sz w:val="20"/>
+          <w:szCs w:val="20"/>
+        </w:rPr>
+      </w:pPr>
+      <w:r>
+        <w:rPr>
+          <w:rFonts w:ascii="Times New Roman" w:hAnsi="Times New Roman" w:cs="Times New Roman"/>
+          <w:b/>
+          <w:sz w:val="20"/>
+          <w:szCs w:val="20"/>
+        </w:rPr>
+        <w:t xml:space="preserve">8. TOMONLARNING MANZILLARI VA REKVIZITLARI</w:t>
       </w:r>
     </w:p>
     <w:p>
@@ -585,7 +855,7 @@
           <w:sz w:val="20"/>
           <w:szCs w:val="20"/>
         </w:rPr>
-        <w:t xml:space="preserve">«MY PERFEKT HOME» MChJ</w:t>
+        <w:t xml:space="preserve">"MY PERFEKT HOME" MCHJ</w:t>
       </w:r>
     </w:p>
     <w:p>
@@ -604,7 +874,7 @@
           <w:sz w:val="20"/>
           <w:szCs w:val="20"/>
         </w:rPr>
-        <w:t xml:space="preserve">Manzil: Toshkent sh., Yangihayot tumani, Uzar ko'chasi, 60-uy, 46-xonadon</w:t>
+        <w:t xml:space="preserve">Manzil: Toshkent shahri, Yangihayot tumani Uzar ko'chasi, 60-uy, 46-xona</w:t>
       </w:r>
     </w:p>
     <w:p>
@@ -623,7 +893,7 @@
           <w:sz w:val="20"/>
           <w:szCs w:val="20"/>
         </w:rPr>
-        <w:t xml:space="preserve">Tel: +99895-711-27-27</w:t>
+        <w:t xml:space="preserve">X/r: 20208000105393795001</w:t>
       </w:r>
     </w:p>
     <w:p>
@@ -642,7 +912,7 @@
           <w:sz w:val="20"/>
           <w:szCs w:val="20"/>
         </w:rPr>
-        <w:t xml:space="preserve">H/r: 20208000105393795001, «Xalq Banki» Do'stobod OPERU</w:t>
+        <w:t xml:space="preserve">"Xalq Bank" Do'stobod BXM.</w:t>
       </w:r>
     </w:p>
     <w:p>
@@ -661,6 +931,25 @@
           <w:sz w:val="20"/>
           <w:szCs w:val="20"/>
         </w:rPr>
+        <w:t xml:space="preserve">Tel: +99877-091-91-01</w:t>
+      </w:r>
+    </w:p>
+    <w:p>
+      <w:pPr>
+        <w:spacing w:after="120" w:line="240" w:lineRule="auto"/>
+        <w:jc w:val="both"/>
+        <w:rPr>
+          <w:rFonts w:ascii="Times New Roman" w:hAnsi="Times New Roman" w:cs="Times New Roman"/>
+          <w:sz w:val="20"/>
+          <w:szCs w:val="20"/>
+        </w:rPr>
+      </w:pPr>
+      <w:r>
+        <w:rPr>
+          <w:rFonts w:ascii="Times New Roman" w:hAnsi="Times New Roman" w:cs="Times New Roman"/>
+          <w:sz w:val="20"/>
+          <w:szCs w:val="20"/>
+        </w:rPr>
         <w:t xml:space="preserve">MFO 01125   INN 308515451   OKED 41100</w:t>
       </w:r>
     </w:p>
@@ -720,6 +1009,25 @@
           <w:sz w:val="20"/>
           <w:szCs w:val="20"/>
         </w:rPr>
+        <w:t xml:space="preserve">Manzil: {manzil}</w:t>
+      </w:r>
+    </w:p>
+    <w:p>
+      <w:pPr>
+        <w:spacing w:after="10" w:line="240" w:lineRule="auto"/>
+        <w:jc w:val="both"/>
+        <w:rPr>
+          <w:rFonts w:ascii="Times New Roman" w:hAnsi="Times New Roman" w:cs="Times New Roman"/>
+          <w:sz w:val="20"/>
+          <w:szCs w:val="20"/>
+        </w:rPr>
+      </w:pPr>
+      <w:r>
+        <w:rPr>
+          <w:rFonts w:ascii="Times New Roman" w:hAnsi="Times New Roman" w:cs="Times New Roman"/>
+          <w:sz w:val="20"/>
+          <w:szCs w:val="20"/>
+        </w:rPr>
         <w:t xml:space="preserve">Pasport: {pasport}, {berilgan}</w:t>
       </w:r>
     </w:p>
@@ -777,7 +1085,7 @@
           <w:sz w:val="20"/>
           <w:szCs w:val="20"/>
         </w:rPr>
-        <w:t xml:space="preserve">Direktor: ______________ Turabekov N.B.                    Buyurtmachi: ______________ {ism}</w:t>
+        <w:t xml:space="preserve">Direktor: ______________ J.Sh.Sarimsakov                    Buyurtmachi: ______________ {ism}</w:t>
       </w:r>
     </w:p>
     <w:p>
@@ -822,6 +1130,25 @@
     </w:p>
     <w:p>
       <w:pPr>
+        <w:spacing w:after="60" w:line="240" w:lineRule="auto"/>
+        <w:jc w:val="both"/>
+        <w:rPr>
+          <w:rFonts w:ascii="Times New Roman" w:hAnsi="Times New Roman" w:cs="Times New Roman"/>
+          <w:sz w:val="20"/>
+          <w:szCs w:val="20"/>
+        </w:rPr>
+      </w:pPr>
+      <w:r>
+        <w:rPr>
+          <w:rFonts w:ascii="Times New Roman" w:hAnsi="Times New Roman" w:cs="Times New Roman"/>
+          <w:sz w:val="20"/>
+          <w:szCs w:val="20"/>
+        </w:rPr>
+        <w:t xml:space="preserve">Biz, quyida imzo chekkan, bir tomondan «IJROCHI» — «MY PERFEKT HOME» MChJ direktori J.Sh.Sarimsakov va ikkinchi tomondan «BUYURTMACHI» — {ism}, shartnoma bo'yicha ishlar umumiy qiymatining 100 %i, ya'ni {narx} so'm ({narx_sozda} so'm, QQSiz) bajarilganini tasdiqlaymiz. «IJROCHI» tomonidan ishlar to'liq hajmda bajarildi. Oldindan to'langan summa {narx} so'm ({narx_sozda} so'm, QQSiz)ni tashkil etadi. To'lashga qolgan summa — yo'q. Tomonlar bir-biriga o'zaro da'volarga ega emas.</w:t>
+      </w:r>
+    </w:p>
+    <w:p>
+      <w:pPr>
         <w:spacing w:after="240" w:line="240" w:lineRule="auto"/>
         <w:jc w:val="both"/>
         <w:rPr>
@@ -836,26 +1163,7 @@
           <w:sz w:val="20"/>
           <w:szCs w:val="20"/>
         </w:rPr>
-        <w:t xml:space="preserve">Biz, quyida imzo chekkan, bir tomondan «IJROCHI» — «MY PERFEKT HOME» MChJ direktori Turabekov N.B. va ikkinchi tomondan «BUYURTMACHI» — {ism}, shartnoma bo'yicha ishlar umumiy qiymatining 100 %i, ya'ni {narx} so'm ({narx_sozda} so'm, QQSsiz) bajarilganini tasdiqlaymiz. «IJROCHI» tomonidan ishlar to'liq hajmda bajarildi. Oldindan to'langan summa {narx} so'm ({narx_sozda} so'm, QQSsiz)ni tashkil etadi. To'lashga qolgan summa — yo'q. Tomonlar bir-biriga o'zaro da'volarga ega emas.</w:t>
-      </w:r>
-    </w:p>
-    <w:p>
-      <w:pPr>
-        <w:spacing w:after="240" w:line="240" w:lineRule="auto"/>
-        <w:jc w:val="both"/>
-        <w:rPr>
-          <w:rFonts w:ascii="Times New Roman" w:hAnsi="Times New Roman" w:cs="Times New Roman"/>
-          <w:sz w:val="20"/>
-          <w:szCs w:val="20"/>
-        </w:rPr>
-      </w:pPr>
-      <w:r>
-        <w:rPr>
-          <w:rFonts w:ascii="Times New Roman" w:hAnsi="Times New Roman" w:cs="Times New Roman"/>
-          <w:sz w:val="20"/>
-          <w:szCs w:val="20"/>
-        </w:rPr>
-        <w:t xml:space="preserve">Direktor: ______________ Turabekov N.B.                    Buyurtmachi: ______________ {ism}</w:t>
+        <w:t xml:space="preserve">Direktor: ______________ J.Sh.Sarimsakov                    Buyurtmachi: ______________ {ism}</w:t>
       </w:r>
     </w:p>
     <w:p>
@@ -914,7 +1222,7 @@
           <w:sz w:val="20"/>
           <w:szCs w:val="20"/>
         </w:rPr>
-        <w:t xml:space="preserve">Ushbu Dalolatnoma «MY PERFEKT HOME» MChJ (direktori Turabekov N.B., Ustav va 26-07-2021 yildagi № AL-001868 litsenziya asosida ish yurituvchi, keyingi o'rinlarda «IJROCHI») bilan «BUYURTMACHI» {ism} o'rtasida pasport asosida tuzildi. Ish mazmuni: hujjatlarni loyihalash va yuritish. Manzil: {manzil}. Ishlar {raqam} — {sana} sanali shartnoma shartlariga muvofiq bajarildi. «IJROCHI» va «BUYURTMACHI» bir-biriga da'volarga ega emas.</w:t>
+        <w:t xml:space="preserve">Ushbu Dalolatnoma «MY PERFEKT HOME» MChJ (direktori J.Sh.Sarimsakov, Ustav va 26-07-2021 yildagi № AL-001868 litsenziya asosida ish yurituvchi, keyingi o'rinlarda «IJROCHI») bilan «BUYURTMACHI» {ism} o'rtasida pasport asosida tuzildi. Ish mazmuni: hujjatlarni loyihalash va yuritish. Manzil: {manzil}. Ishlar {raqam} — {sana} sanali shartnoma shartlariga muvofiq bajarildi. «IJROCHI» va «BUYURTMACHI» bir-biriga da'volarga ega emas.</w:t>
       </w:r>
     </w:p>
     <w:p>
@@ -933,7 +1241,7 @@
           <w:sz w:val="20"/>
           <w:szCs w:val="20"/>
         </w:rPr>
-        <w:t xml:space="preserve">IJROCHI: ______________ Turabekov N.B.                    BUYURTMACHI: ______________ {ism}</w:t>
+        <w:t xml:space="preserve">IJROCHI: ______________ J.Sh.Sarimsakov                    BUYURTMACHI: ______________ {ism}</w:t>
       </w:r>
     </w:p>
     <w:sectPr>

</xml_diff>